<commit_message>
-Create admin list page. -Add back button for create admin page. -Update create page to able to edit same page.
</commit_message>
<xml_diff>
--- a/oripa_spec_v1.1.docx
+++ b/oripa_spec_v1.1.docx
@@ -1005,7 +1005,7 @@
         <w:rPr>
           <w:noProof/>
         </w:rPr>
-        <w:pict w14:anchorId="2AF8CD8F">
+        <w:pict w14:anchorId="77AFF694">
           <v:rect id="_x0000_i1028" alt="" style="width:425.2pt;height:.05pt;mso-width-percent:0;mso-height-percent:0;mso-width-percent:0;mso-height-percent:0" o:hralign="center" o:hrstd="t" o:hr="t" fillcolor="#a0a0a0" stroked="f">
             <v:textbox inset="5.85pt,.7pt,5.85pt,.7pt"/>
           </v:rect>
@@ -1283,7 +1283,7 @@
         <w:rPr>
           <w:noProof/>
         </w:rPr>
-        <w:pict w14:anchorId="77DA492C">
+        <w:pict w14:anchorId="301E4075">
           <v:rect id="_x0000_i1027" alt="" style="width:425.2pt;height:.05pt;mso-width-percent:0;mso-height-percent:0;mso-width-percent:0;mso-height-percent:0" o:hralign="center" o:hrstd="t" o:hr="t" fillcolor="#a0a0a0" stroked="f">
             <v:textbox inset="5.85pt,.7pt,5.85pt,.7pt"/>
           </v:rect>
@@ -1702,7 +1702,7 @@
         <w:rPr>
           <w:noProof/>
         </w:rPr>
-        <w:pict w14:anchorId="6FA26CB8">
+        <w:pict w14:anchorId="4C478DCC">
           <v:rect id="_x0000_i1026" alt="" style="width:425.2pt;height:.05pt;mso-width-percent:0;mso-height-percent:0;mso-width-percent:0;mso-height-percent:0" o:hralign="center" o:hrstd="t" o:hr="t" fillcolor="#a0a0a0" stroked="f">
             <v:textbox inset="5.85pt,.7pt,5.85pt,.7pt"/>
           </v:rect>
@@ -2184,7 +2184,7 @@
         <w:rPr>
           <w:noProof/>
         </w:rPr>
-        <w:pict w14:anchorId="42463BED">
+        <w:pict w14:anchorId="6FF8B6EE">
           <v:rect id="_x0000_i1025" alt="" style="width:425.2pt;height:.05pt;mso-width-percent:0;mso-height-percent:0;mso-width-percent:0;mso-height-percent:0" o:hralign="center" o:hrstd="t" o:hr="t" fillcolor="#a0a0a0" stroked="f">
             <v:textbox inset="5.85pt,.7pt,5.85pt,.7pt"/>
           </v:rect>
@@ -3313,6 +3313,105 @@
           <w:lang w:eastAsia="ja-JP"/>
         </w:rPr>
       </w:pPr>
+      <w:r>
+        <w:rPr>
+          <w:rFonts w:hint="eastAsia"/>
+          <w:lang w:eastAsia="ja-JP"/>
+        </w:rPr>
+        <w:t>ユーザー登録</w:t>
+      </w:r>
+      <w:r>
+        <w:rPr>
+          <w:lang w:eastAsia="ja-JP"/>
+        </w:rPr>
+        <w:t>,</w:t>
+      </w:r>
+      <w:r>
+        <w:rPr>
+          <w:rFonts w:hint="eastAsia"/>
+          <w:lang w:eastAsia="ja-JP"/>
+        </w:rPr>
+        <w:t>電話番号追加</w:t>
+      </w:r>
+    </w:p>
+    <w:p>
+      <w:pPr>
+        <w:rPr>
+          <w:lang w:eastAsia="ja-JP"/>
+        </w:rPr>
+      </w:pPr>
+      <w:r>
+        <w:rPr>
+          <w:rFonts w:hint="eastAsia"/>
+          <w:lang w:eastAsia="ja-JP"/>
+        </w:rPr>
+        <w:t>単発、複数回、残り全て</w:t>
+      </w:r>
+    </w:p>
+    <w:p>
+      <w:pPr>
+        <w:rPr>
+          <w:b/>
+          <w:bCs/>
+          <w:lang w:eastAsia="ja-JP"/>
+        </w:rPr>
+      </w:pPr>
+      <w:r>
+        <w:rPr>
+          <w:rFonts w:hint="eastAsia"/>
+          <w:b/>
+          <w:bCs/>
+          <w:lang w:eastAsia="ja-JP"/>
+        </w:rPr>
+        <w:t>当選カードのポイント変換機能</w:t>
+      </w:r>
+    </w:p>
+    <w:p>
+      <w:pPr>
+        <w:rPr>
+          <w:b/>
+          <w:bCs/>
+          <w:lang w:eastAsia="ja-JP"/>
+        </w:rPr>
+      </w:pPr>
+      <w:r>
+        <w:rPr>
+          <w:rFonts w:hint="eastAsia"/>
+          <w:b/>
+          <w:bCs/>
+          <w:lang w:eastAsia="ja-JP"/>
+        </w:rPr>
+        <w:t>ポイントにしか変換できない機能と発想しかできない機能</w:t>
+      </w:r>
+    </w:p>
+    <w:p>
+      <w:pPr>
+        <w:rPr>
+          <w:lang w:eastAsia="ja-JP"/>
+        </w:rPr>
+      </w:pPr>
+      <w:r>
+        <w:rPr>
+          <w:rFonts w:hint="eastAsia"/>
+          <w:lang w:eastAsia="ja-JP"/>
+        </w:rPr>
+        <w:t>パスワードの制限</w:t>
+      </w:r>
+    </w:p>
+    <w:p>
+      <w:pPr>
+        <w:rPr>
+          <w:rFonts w:hint="eastAsia"/>
+          <w:lang w:eastAsia="ja-JP"/>
+        </w:rPr>
+      </w:pPr>
+      <w:r>
+        <w:rPr>
+          <w:rFonts w:hint="eastAsia"/>
+          <w:lang w:eastAsia="ja-JP"/>
+        </w:rPr>
+        <w:t>アカウントの上限数</w:t>
+      </w:r>
     </w:p>
     <w:sectPr>
       <w:pgSz w:w="12240" w:h="15840"/>

</xml_diff>

<commit_message>
-Create gacha page. -Can edit gacha page.
</commit_message>
<xml_diff>
--- a/oripa_spec_v1.1.docx
+++ b/oripa_spec_v1.1.docx
@@ -1005,7 +1005,7 @@
         <w:rPr>
           <w:noProof/>
         </w:rPr>
-        <w:pict w14:anchorId="77AFF694">
+        <w:pict w14:anchorId="2191B475">
           <v:rect id="_x0000_i1028" alt="" style="width:425.2pt;height:.05pt;mso-width-percent:0;mso-height-percent:0;mso-width-percent:0;mso-height-percent:0" o:hralign="center" o:hrstd="t" o:hr="t" fillcolor="#a0a0a0" stroked="f">
             <v:textbox inset="5.85pt,.7pt,5.85pt,.7pt"/>
           </v:rect>
@@ -1283,7 +1283,7 @@
         <w:rPr>
           <w:noProof/>
         </w:rPr>
-        <w:pict w14:anchorId="301E4075">
+        <w:pict w14:anchorId="26E6E73C">
           <v:rect id="_x0000_i1027" alt="" style="width:425.2pt;height:.05pt;mso-width-percent:0;mso-height-percent:0;mso-width-percent:0;mso-height-percent:0" o:hralign="center" o:hrstd="t" o:hr="t" fillcolor="#a0a0a0" stroked="f">
             <v:textbox inset="5.85pt,.7pt,5.85pt,.7pt"/>
           </v:rect>
@@ -1702,7 +1702,7 @@
         <w:rPr>
           <w:noProof/>
         </w:rPr>
-        <w:pict w14:anchorId="4C478DCC">
+        <w:pict w14:anchorId="36ADCEF9">
           <v:rect id="_x0000_i1026" alt="" style="width:425.2pt;height:.05pt;mso-width-percent:0;mso-height-percent:0;mso-width-percent:0;mso-height-percent:0" o:hralign="center" o:hrstd="t" o:hr="t" fillcolor="#a0a0a0" stroked="f">
             <v:textbox inset="5.85pt,.7pt,5.85pt,.7pt"/>
           </v:rect>
@@ -2184,7 +2184,7 @@
         <w:rPr>
           <w:noProof/>
         </w:rPr>
-        <w:pict w14:anchorId="6FF8B6EE">
+        <w:pict w14:anchorId="48AFAB55">
           <v:rect id="_x0000_i1025" alt="" style="width:425.2pt;height:.05pt;mso-width-percent:0;mso-height-percent:0;mso-width-percent:0;mso-height-percent:0" o:hralign="center" o:hrstd="t" o:hr="t" fillcolor="#a0a0a0" stroked="f">
             <v:textbox inset="5.85pt,.7pt,5.85pt,.7pt"/>
           </v:rect>
@@ -3318,33 +3318,6 @@
           <w:rFonts w:hint="eastAsia"/>
           <w:lang w:eastAsia="ja-JP"/>
         </w:rPr>
-        <w:t>ユーザー登録</w:t>
-      </w:r>
-      <w:r>
-        <w:rPr>
-          <w:lang w:eastAsia="ja-JP"/>
-        </w:rPr>
-        <w:t>,</w:t>
-      </w:r>
-      <w:r>
-        <w:rPr>
-          <w:rFonts w:hint="eastAsia"/>
-          <w:lang w:eastAsia="ja-JP"/>
-        </w:rPr>
-        <w:t>電話番号追加</w:t>
-      </w:r>
-    </w:p>
-    <w:p>
-      <w:pPr>
-        <w:rPr>
-          <w:lang w:eastAsia="ja-JP"/>
-        </w:rPr>
-      </w:pPr>
-      <w:r>
-        <w:rPr>
-          <w:rFonts w:hint="eastAsia"/>
-          <w:lang w:eastAsia="ja-JP"/>
-        </w:rPr>
         <w:t>単発、複数回、残り全て</w:t>
       </w:r>
     </w:p>
@@ -3390,28 +3363,6 @@
           <w:lang w:eastAsia="ja-JP"/>
         </w:rPr>
       </w:pPr>
-      <w:r>
-        <w:rPr>
-          <w:rFonts w:hint="eastAsia"/>
-          <w:lang w:eastAsia="ja-JP"/>
-        </w:rPr>
-        <w:t>パスワードの制限</w:t>
-      </w:r>
-    </w:p>
-    <w:p>
-      <w:pPr>
-        <w:rPr>
-          <w:rFonts w:hint="eastAsia"/>
-          <w:lang w:eastAsia="ja-JP"/>
-        </w:rPr>
-      </w:pPr>
-      <w:r>
-        <w:rPr>
-          <w:rFonts w:hint="eastAsia"/>
-          <w:lang w:eastAsia="ja-JP"/>
-        </w:rPr>
-        <w:t>アカウントの上限数</w:t>
-      </w:r>
     </w:p>
     <w:sectPr>
       <w:pgSz w:w="12240" w:h="15840"/>

</xml_diff>